<commit_message>
Warm golden redesign, product images, layout cleanup
</commit_message>
<xml_diff>
--- a/Documentation/Making Updates to Code and Spreadsheet.docx
+++ b/Documentation/Making Updates to Code and Spreadsheet.docx
@@ -703,120 +703,6 @@
     </w:p>
     <w:p>
       <w:pPr>
-        <w:tabs>
-          <w:tab w:val="left" w:pos="916"/>
-          <w:tab w:val="left" w:pos="1832"/>
-          <w:tab w:val="left" w:pos="2748"/>
-          <w:tab w:val="left" w:pos="3664"/>
-          <w:tab w:val="left" w:pos="4580"/>
-          <w:tab w:val="left" w:pos="5496"/>
-          <w:tab w:val="left" w:pos="6412"/>
-          <w:tab w:val="left" w:pos="7328"/>
-          <w:tab w:val="left" w:pos="8244"/>
-          <w:tab w:val="left" w:pos="9160"/>
-          <w:tab w:val="left" w:pos="10076"/>
-          <w:tab w:val="left" w:pos="10992"/>
-          <w:tab w:val="left" w:pos="11908"/>
-          <w:tab w:val="left" w:pos="12824"/>
-          <w:tab w:val="left" w:pos="13740"/>
-          <w:tab w:val="left" w:pos="14656"/>
-        </w:tabs>
-        <w:spacing w:after="0" w:line="240" w:lineRule="auto"/>
-        <w:rPr>
-          <w:rFonts w:eastAsia="Times New Roman" w:cs="Courier New"/>
-          <w:color w:val="14181F"/>
-          <w:kern w:val="0"/>
-          <w14:ligatures w14:val="none"/>
-        </w:rPr>
-      </w:pPr>
-      <w:r>
-        <w:rPr>
-          <w:rFonts w:eastAsia="Times New Roman" w:cs="Courier New"/>
-          <w:color w:val="14181F"/>
-          <w:kern w:val="0"/>
-          <w14:ligatures w14:val="none"/>
-        </w:rPr>
-        <w:t xml:space="preserve">   git add -A</w:t>
-      </w:r>
-    </w:p>
-    <w:p>
-      <w:pPr>
-        <w:tabs>
-          <w:tab w:val="left" w:pos="916"/>
-          <w:tab w:val="left" w:pos="1832"/>
-          <w:tab w:val="left" w:pos="2748"/>
-          <w:tab w:val="left" w:pos="3664"/>
-          <w:tab w:val="left" w:pos="4580"/>
-          <w:tab w:val="left" w:pos="5496"/>
-          <w:tab w:val="left" w:pos="6412"/>
-          <w:tab w:val="left" w:pos="7328"/>
-          <w:tab w:val="left" w:pos="8244"/>
-          <w:tab w:val="left" w:pos="9160"/>
-          <w:tab w:val="left" w:pos="10076"/>
-          <w:tab w:val="left" w:pos="10992"/>
-          <w:tab w:val="left" w:pos="11908"/>
-          <w:tab w:val="left" w:pos="12824"/>
-          <w:tab w:val="left" w:pos="13740"/>
-          <w:tab w:val="left" w:pos="14656"/>
-        </w:tabs>
-        <w:spacing w:after="0" w:line="240" w:lineRule="auto"/>
-        <w:rPr>
-          <w:rFonts w:eastAsia="Times New Roman" w:cs="Courier New"/>
-          <w:color w:val="14181F"/>
-          <w:kern w:val="0"/>
-          <w14:ligatures w14:val="none"/>
-        </w:rPr>
-      </w:pPr>
-      <w:r>
-        <w:rPr>
-          <w:rFonts w:eastAsia="Times New Roman" w:cs="Courier New"/>
-          <w:color w:val="14181F"/>
-          <w:kern w:val="0"/>
-          <w14:ligatures w14:val="none"/>
-        </w:rPr>
-        <w:t xml:space="preserve">   git commit -m "Rename site and simplify homepage"</w:t>
-      </w:r>
-    </w:p>
-    <w:p>
-      <w:pPr>
-        <w:tabs>
-          <w:tab w:val="left" w:pos="916"/>
-          <w:tab w:val="left" w:pos="1832"/>
-          <w:tab w:val="left" w:pos="2748"/>
-          <w:tab w:val="left" w:pos="3664"/>
-          <w:tab w:val="left" w:pos="4580"/>
-          <w:tab w:val="left" w:pos="5496"/>
-          <w:tab w:val="left" w:pos="6412"/>
-          <w:tab w:val="left" w:pos="7328"/>
-          <w:tab w:val="left" w:pos="8244"/>
-          <w:tab w:val="left" w:pos="9160"/>
-          <w:tab w:val="left" w:pos="10076"/>
-          <w:tab w:val="left" w:pos="10992"/>
-          <w:tab w:val="left" w:pos="11908"/>
-          <w:tab w:val="left" w:pos="12824"/>
-          <w:tab w:val="left" w:pos="13740"/>
-          <w:tab w:val="left" w:pos="14656"/>
-        </w:tabs>
-        <w:spacing w:after="0" w:line="240" w:lineRule="auto"/>
-        <w:rPr>
-          <w:rFonts w:eastAsia="Times New Roman" w:cs="Courier New"/>
-          <w:color w:val="14181F"/>
-          <w:kern w:val="0"/>
-          <w14:ligatures w14:val="none"/>
-        </w:rPr>
-      </w:pPr>
-      <w:r>
-        <w:rPr>
-          <w:rFonts w:eastAsia="Times New Roman" w:cs="Courier New"/>
-          <w:color w:val="14181F"/>
-          <w:kern w:val="0"/>
-          <w14:ligatures w14:val="none"/>
-        </w:rPr>
-        <w:t xml:space="preserve">   git push origin main</w:t>
-      </w:r>
-    </w:p>
-    <w:p>
-      <w:pPr>
         <w:numPr>
           <w:ilvl w:val="0"/>
           <w:numId w:val="4"/>
@@ -850,144 +736,7 @@
     <w:p>
       <w:pPr>
         <w:spacing w:before="100" w:beforeAutospacing="1" w:after="100" w:afterAutospacing="1" w:line="240" w:lineRule="auto"/>
-        <w:rPr>
-          <w:rFonts w:eastAsia="Times New Roman" w:cs="Times New Roman"/>
-          <w:kern w:val="0"/>
-          <w14:ligatures w14:val="none"/>
-        </w:rPr>
-      </w:pPr>
-      <w:r>
-        <w:rPr>
-          <w:rFonts w:eastAsia="Times New Roman" w:cs="Times New Roman"/>
-          <w:kern w:val="0"/>
-          <w14:ligatures w14:val="none"/>
-        </w:rPr>
-        <w:t>Let me know what you see when the site comes up.</w:t>
-      </w:r>
-    </w:p>
-    <w:p>
-      <w:pPr>
-        <w:spacing w:after="0" w:line="240" w:lineRule="auto"/>
-        <w:rPr>
-          <w:rFonts w:eastAsia="Times New Roman" w:cs="Times New Roman"/>
-          <w:kern w:val="0"/>
-          <w14:ligatures w14:val="none"/>
-        </w:rPr>
-      </w:pPr>
-      <w:r>
-        <w:rPr>
-          <w:rFonts w:eastAsia="Times New Roman" w:cs="Times New Roman"/>
-          <w:kern w:val="0"/>
-          <w14:ligatures w14:val="none"/>
-        </w:rPr>
-        <w:t>Changes</w:t>
-      </w:r>
-    </w:p>
-    <w:p>
-      <w:pPr>
-        <w:spacing w:after="0" w:line="240" w:lineRule="auto"/>
-        <w:rPr>
-          <w:rFonts w:eastAsia="Times New Roman" w:cs="Times New Roman"/>
-          <w:kern w:val="0"/>
-          <w14:ligatures w14:val="none"/>
-        </w:rPr>
-      </w:pPr>
-      <w:r>
-        <w:rPr>
-          <w:rFonts w:eastAsia="Times New Roman" w:cs="Times New Roman"/>
-          <w:kern w:val="0"/>
-          <w14:ligatures w14:val="none"/>
-        </w:rPr>
-        <w:t>ZIP </w:t>
-      </w:r>
-    </w:p>
-    <w:p>
-      <w:pPr>
-        <w:spacing w:after="0" w:line="240" w:lineRule="auto"/>
-        <w:rPr>
-          <w:rFonts w:eastAsia="Times New Roman" w:cs="Times New Roman"/>
-          <w:kern w:val="0"/>
-          <w14:ligatures w14:val="none"/>
-        </w:rPr>
-      </w:pPr>
-      <w:r>
-        <w:rPr>
-          <w:rFonts w:eastAsia="Times New Roman" w:cs="Times New Roman"/>
-          <w:noProof/>
-          <w:kern w:val="0"/>
-          <w14:ligatures w14:val="none"/>
-        </w:rPr>
-        <w:drawing>
-          <wp:inline distT="0" distB="0" distL="0" distR="0" wp14:anchorId="766C6BBF" wp14:editId="04037A3D">
-            <wp:extent cx="190500" cy="190500"/>
-            <wp:effectExtent l="0" t="0" r="0" b="0"/>
-            <wp:docPr id="1" name="Picture 1" descr="Open file on desktop"/>
-            <wp:cNvGraphicFramePr>
-              <a:graphicFrameLocks xmlns:a="http://schemas.openxmlformats.org/drawingml/2006/main" noChangeAspect="1"/>
-            </wp:cNvGraphicFramePr>
-            <a:graphic xmlns:a="http://schemas.openxmlformats.org/drawingml/2006/main">
-              <a:graphicData uri="http://schemas.openxmlformats.org/drawingml/2006/picture">
-                <pic:pic xmlns:pic="http://schemas.openxmlformats.org/drawingml/2006/picture">
-                  <pic:nvPicPr>
-                    <pic:cNvPr id="0" name="Picture 1" descr="Open file on desktop"/>
-                    <pic:cNvPicPr>
-                      <a:picLocks noChangeAspect="1" noChangeArrowheads="1"/>
-                    </pic:cNvPicPr>
-                  </pic:nvPicPr>
-                  <pic:blipFill>
-                    <a:blip r:embed="rId5" cstate="print">
-                      <a:extLst>
-                        <a:ext uri="{28A0092B-C50C-407E-A947-70E740481C1C}">
-                          <a14:useLocalDpi xmlns:a14="http://schemas.microsoft.com/office/drawing/2010/main" val="0"/>
-                        </a:ext>
-                      </a:extLst>
-                    </a:blip>
-                    <a:srcRect/>
-                    <a:stretch>
-                      <a:fillRect/>
-                    </a:stretch>
-                  </pic:blipFill>
-                  <pic:spPr bwMode="auto">
-                    <a:xfrm>
-                      <a:off x="0" y="0"/>
-                      <a:ext cx="190500" cy="190500"/>
-                    </a:xfrm>
-                    <a:prstGeom prst="rect">
-                      <a:avLst/>
-                    </a:prstGeom>
-                    <a:noFill/>
-                    <a:ln>
-                      <a:noFill/>
-                    </a:ln>
-                  </pic:spPr>
-                </pic:pic>
-              </a:graphicData>
-            </a:graphic>
-          </wp:inline>
-        </w:drawing>
-      </w:r>
-      <w:r>
-        <w:rPr>
-          <w:rFonts w:eastAsia="Times New Roman" w:cs="Times New Roman"/>
-          <w:kern w:val="0"/>
-          <w14:ligatures w14:val="none"/>
-        </w:rPr>
-        <w:t>Open in Windows Explorer</w:t>
-      </w:r>
-    </w:p>
-    <w:p>
-      <w:pPr>
-        <w:spacing w:before="100" w:beforeAutospacing="1" w:after="100" w:afterAutospacing="1" w:line="240" w:lineRule="auto"/>
-        <w:rPr>
-          <w:rFonts w:eastAsia="Times New Roman" w:cs="Times New Roman"/>
-          <w:kern w:val="0"/>
-          <w14:ligatures w14:val="none"/>
-        </w:rPr>
-      </w:pPr>
-    </w:p>
-    <w:p>
-      <w:pPr>
-        <w:spacing w:before="100" w:beforeAutospacing="1" w:after="100" w:afterAutospacing="1" w:line="240" w:lineRule="auto"/>
+        <w:ind w:left="360"/>
         <w:rPr>
           <w:rFonts w:eastAsia="Times New Roman" w:cs="Times New Roman"/>
           <w:kern w:val="0"/>
@@ -1084,142 +833,15 @@
       <w:pPr>
         <w:rPr>
           <w:rFonts w:eastAsia="Times New Roman" w:cs="Times New Roman"/>
-          <w:kern w:val="0"/>
-          <w14:ligatures w14:val="none"/>
-        </w:rPr>
-      </w:pPr>
-    </w:p>
-    <w:p>
-      <w:pPr>
-        <w:rPr>
-          <w:rFonts w:eastAsia="Times New Roman" w:cs="Times New Roman"/>
-          <w:kern w:val="0"/>
-          <w14:ligatures w14:val="none"/>
-        </w:rPr>
-      </w:pPr>
-      <w:r>
-        <w:rPr>
-          <w:rFonts w:eastAsia="Times New Roman" w:cs="Times New Roman"/>
-          <w:kern w:val="0"/>
-          <w14:ligatures w14:val="none"/>
-        </w:rPr>
-        <w:t>From your terminal (Git Bash or Command Prompt), inside the repo folder:</w:t>
-      </w:r>
-    </w:p>
-    <w:p>
-      <w:pPr>
-        <w:rPr>
-          <w:rFonts w:eastAsia="Times New Roman" w:cs="Times New Roman"/>
-          <w:kern w:val="0"/>
-          <w14:ligatures w14:val="none"/>
-        </w:rPr>
-      </w:pPr>
-      <w:r>
-        <w:rPr>
-          <w:rFonts w:eastAsia="Times New Roman" w:cs="Times New Roman"/>
-          <w:kern w:val="0"/>
-          <w14:ligatures w14:val="none"/>
-        </w:rPr>
-        <w:t>cd "C:\Users\Tim Thomasson\Interactive-Pet-Marketplace"</w:t>
-      </w:r>
-    </w:p>
-    <w:p>
-      <w:pPr>
-        <w:rPr>
-          <w:rFonts w:eastAsia="Times New Roman" w:cs="Times New Roman"/>
-          <w:kern w:val="0"/>
-          <w14:ligatures w14:val="none"/>
-        </w:rPr>
-      </w:pPr>
-      <w:r>
-        <w:rPr>
-          <w:rFonts w:eastAsia="Times New Roman" w:cs="Times New Roman"/>
-          <w:kern w:val="0"/>
-          <w14:ligatures w14:val="none"/>
-        </w:rPr>
-        <w:t>Then three commands, one at a time:</w:t>
-      </w:r>
-    </w:p>
-    <w:p>
-      <w:pPr>
-        <w:rPr>
-          <w:rFonts w:eastAsia="Times New Roman" w:cs="Times New Roman"/>
-          <w:kern w:val="0"/>
-          <w14:ligatures w14:val="none"/>
-        </w:rPr>
-      </w:pPr>
-      <w:r>
-        <w:rPr>
-          <w:rFonts w:eastAsia="Times New Roman" w:cs="Times New Roman"/>
           <w:b/>
           <w:bCs/>
           <w:kern w:val="0"/>
           <w14:ligatures w14:val="none"/>
         </w:rPr>
-        <w:t>1. Stage all your changes:</w:t>
-      </w:r>
-    </w:p>
-    <w:p>
-      <w:pPr>
-        <w:rPr>
-          <w:rFonts w:eastAsia="Times New Roman" w:cs="Times New Roman"/>
-          <w:kern w:val="0"/>
-          <w14:ligatures w14:val="none"/>
-        </w:rPr>
-      </w:pPr>
-      <w:r>
-        <w:rPr>
-          <w:rFonts w:eastAsia="Times New Roman" w:cs="Times New Roman"/>
-          <w:kern w:val="0"/>
-          <w14:ligatures w14:val="none"/>
-        </w:rPr>
-        <w:t>git add -A</w:t>
-      </w:r>
-    </w:p>
-    <w:p>
-      <w:pPr>
-        <w:rPr>
-          <w:rFonts w:eastAsia="Times New Roman" w:cs="Times New Roman"/>
-          <w:kern w:val="0"/>
-          <w14:ligatures w14:val="none"/>
-        </w:rPr>
-      </w:pPr>
-      <w:r>
-        <w:rPr>
-          <w:rFonts w:eastAsia="Times New Roman" w:cs="Times New Roman"/>
-          <w:kern w:val="0"/>
-          <w14:ligatures w14:val="none"/>
-        </w:rPr>
-        <w:t xml:space="preserve">This tells </w:t>
-      </w:r>
-      <w:proofErr w:type="gramStart"/>
-      <w:r>
-        <w:rPr>
-          <w:rFonts w:eastAsia="Times New Roman" w:cs="Times New Roman"/>
-          <w:kern w:val="0"/>
-          <w14:ligatures w14:val="none"/>
-        </w:rPr>
-        <w:t>Git</w:t>
-      </w:r>
-      <w:proofErr w:type="gramEnd"/>
-      <w:r>
-        <w:rPr>
-          <w:rFonts w:eastAsia="Times New Roman" w:cs="Times New Roman"/>
-          <w:kern w:val="0"/>
-          <w14:ligatures w14:val="none"/>
-        </w:rPr>
-        <w:t xml:space="preserve"> "include everything that's new, modified, or deleted." Silent if it works.</w:t>
-      </w:r>
-    </w:p>
-    <w:p>
-      <w:pPr>
-        <w:rPr>
-          <w:rFonts w:eastAsia="Times New Roman" w:cs="Times New Roman"/>
-          <w:kern w:val="0"/>
-          <w14:ligatures w14:val="none"/>
-        </w:rPr>
-      </w:pPr>
-      <w:r>
+      </w:pPr>
+    </w:p>
+    <w:p>
+      <w:pPr>
         <w:rPr>
           <w:rFonts w:eastAsia="Times New Roman" w:cs="Times New Roman"/>
           <w:b/>
@@ -1227,10 +849,10 @@
           <w:kern w:val="0"/>
           <w14:ligatures w14:val="none"/>
         </w:rPr>
-        <w:t xml:space="preserve">2. </w:t>
-      </w:r>
-      <w:proofErr w:type="gramStart"/>
-      <w:r>
+      </w:pPr>
+    </w:p>
+    <w:p>
+      <w:pPr>
         <w:rPr>
           <w:rFonts w:eastAsia="Times New Roman" w:cs="Times New Roman"/>
           <w:b/>
@@ -1238,9 +860,7 @@
           <w:kern w:val="0"/>
           <w14:ligatures w14:val="none"/>
         </w:rPr>
-        <w:t>Commit with</w:t>
-      </w:r>
-      <w:proofErr w:type="gramEnd"/>
+      </w:pPr>
       <w:r>
         <w:rPr>
           <w:rFonts w:eastAsia="Times New Roman" w:cs="Times New Roman"/>
@@ -1249,52 +869,12 @@
           <w:kern w:val="0"/>
           <w14:ligatures w14:val="none"/>
         </w:rPr>
-        <w:t xml:space="preserve"> a message:</w:t>
-      </w:r>
-    </w:p>
-    <w:p>
-      <w:pPr>
-        <w:rPr>
-          <w:rFonts w:eastAsia="Times New Roman" w:cs="Times New Roman"/>
-          <w:kern w:val="0"/>
-          <w14:ligatures w14:val="none"/>
-        </w:rPr>
-      </w:pPr>
-      <w:r>
-        <w:rPr>
-          <w:rFonts w:eastAsia="Times New Roman" w:cs="Times New Roman"/>
-          <w:kern w:val="0"/>
-          <w14:ligatures w14:val="none"/>
-        </w:rPr>
-        <w:t>git commit -m "Warm golden redesign and 5 real products"</w:t>
-      </w:r>
-    </w:p>
-    <w:p>
-      <w:pPr>
-        <w:rPr>
-          <w:rFonts w:eastAsia="Times New Roman" w:cs="Times New Roman"/>
-          <w:kern w:val="0"/>
-          <w14:ligatures w14:val="none"/>
-        </w:rPr>
-      </w:pPr>
-      <w:r>
-        <w:rPr>
-          <w:rFonts w:eastAsia="Times New Roman" w:cs="Times New Roman"/>
-          <w:kern w:val="0"/>
-          <w14:ligatures w14:val="none"/>
-        </w:rPr>
-        <w:t>You'll see output listing the files and the commit hash.</w:t>
-      </w:r>
-    </w:p>
-    <w:p>
-      <w:pPr>
-        <w:rPr>
-          <w:rFonts w:eastAsia="Times New Roman" w:cs="Times New Roman"/>
-          <w:kern w:val="0"/>
-          <w14:ligatures w14:val="none"/>
-        </w:rPr>
-      </w:pPr>
-      <w:r>
+        <w:lastRenderedPageBreak/>
+        <w:t>CHANGES TO ‘PRODUCT MATRIX’ SPREADSHEET</w:t>
+      </w:r>
+    </w:p>
+    <w:p>
+      <w:pPr>
         <w:rPr>
           <w:rFonts w:eastAsia="Times New Roman" w:cs="Times New Roman"/>
           <w:b/>
@@ -1302,122 +882,121 @@
           <w:kern w:val="0"/>
           <w14:ligatures w14:val="none"/>
         </w:rPr>
-        <w:t>3. Push to GitHub:</w:t>
-      </w:r>
-    </w:p>
-    <w:p>
-      <w:pPr>
-        <w:rPr>
-          <w:rFonts w:eastAsia="Times New Roman" w:cs="Times New Roman"/>
-          <w:kern w:val="0"/>
-          <w14:ligatures w14:val="none"/>
-        </w:rPr>
-      </w:pPr>
-      <w:r>
-        <w:rPr>
-          <w:rFonts w:eastAsia="Times New Roman" w:cs="Times New Roman"/>
-          <w:kern w:val="0"/>
-          <w14:ligatures w14:val="none"/>
-        </w:rPr>
-        <w:t>git push origin main</w:t>
-      </w:r>
-    </w:p>
-    <w:p>
-      <w:pPr>
-        <w:rPr>
-          <w:rFonts w:eastAsia="Times New Roman" w:cs="Times New Roman"/>
-          <w:kern w:val="0"/>
-          <w14:ligatures w14:val="none"/>
-        </w:rPr>
-      </w:pPr>
-      <w:r>
-        <w:rPr>
-          <w:rFonts w:eastAsia="Times New Roman" w:cs="Times New Roman"/>
-          <w:kern w:val="0"/>
-          <w14:ligatures w14:val="none"/>
-        </w:rPr>
-        <w:t>This sends your local commits up to GitHub. You might get a browser prompt to sign in — approve it.</w:t>
-      </w:r>
-    </w:p>
-    <w:p>
-      <w:pPr>
-        <w:rPr>
-          <w:rFonts w:eastAsia="Times New Roman" w:cs="Times New Roman"/>
-          <w:kern w:val="0"/>
-          <w14:ligatures w14:val="none"/>
-        </w:rPr>
-      </w:pPr>
-      <w:r>
-        <w:rPr>
-          <w:rFonts w:eastAsia="Times New Roman" w:cs="Times New Roman"/>
-          <w:b/>
-          <w:bCs/>
-          <w:kern w:val="0"/>
-          <w14:ligatures w14:val="none"/>
-        </w:rPr>
-        <w:t>To check what's about to be committed before you commit:</w:t>
-      </w:r>
-    </w:p>
-    <w:p>
-      <w:pPr>
-        <w:rPr>
-          <w:rFonts w:eastAsia="Times New Roman" w:cs="Times New Roman"/>
-          <w:kern w:val="0"/>
-          <w14:ligatures w14:val="none"/>
-        </w:rPr>
-      </w:pPr>
-      <w:r>
-        <w:rPr>
-          <w:rFonts w:eastAsia="Times New Roman" w:cs="Times New Roman"/>
-          <w:kern w:val="0"/>
-          <w14:ligatures w14:val="none"/>
-        </w:rPr>
-        <w:t>git status</w:t>
-      </w:r>
-    </w:p>
-    <w:p>
-      <w:pPr>
-        <w:rPr>
-          <w:rFonts w:eastAsia="Times New Roman" w:cs="Times New Roman"/>
-          <w:kern w:val="0"/>
-          <w14:ligatures w14:val="none"/>
-        </w:rPr>
-      </w:pPr>
-      <w:r>
-        <w:rPr>
-          <w:rFonts w:eastAsia="Times New Roman" w:cs="Times New Roman"/>
-          <w:kern w:val="0"/>
-          <w14:ligatures w14:val="none"/>
-        </w:rPr>
-        <w:t>Shows modified/new files in red (not staged) or green (staged).</w:t>
-      </w:r>
-    </w:p>
-    <w:p>
-      <w:pPr>
-        <w:rPr>
-          <w:rFonts w:eastAsia="Times New Roman" w:cs="Times New Roman"/>
-          <w:kern w:val="0"/>
-          <w14:ligatures w14:val="none"/>
-        </w:rPr>
-      </w:pPr>
-      <w:r>
-        <w:rPr>
-          <w:rFonts w:eastAsia="Times New Roman" w:cs="Times New Roman"/>
-          <w:b/>
-          <w:bCs/>
-          <w:kern w:val="0"/>
-          <w14:ligatures w14:val="none"/>
-        </w:rPr>
-        <w:t>Quick reference for future:</w:t>
-      </w:r>
-      <w:r>
-        <w:rPr>
-          <w:rFonts w:eastAsia="Times New Roman" w:cs="Times New Roman"/>
-          <w:kern w:val="0"/>
-          <w14:ligatures w14:val="none"/>
-        </w:rPr>
-        <w:t xml:space="preserve"> Every commit needs a message describing what </w:t>
-      </w:r>
+      </w:pPr>
+    </w:p>
+    <w:p>
+      <w:pPr>
+        <w:rPr>
+          <w:rFonts w:eastAsia="Times New Roman" w:cs="Times New Roman"/>
+          <w:kern w:val="0"/>
+          <w14:ligatures w14:val="none"/>
+        </w:rPr>
+      </w:pPr>
+      <w:r>
+        <w:rPr>
+          <w:rFonts w:eastAsia="Times New Roman" w:cs="Times New Roman"/>
+          <w:kern w:val="0"/>
+          <w14:ligatures w14:val="none"/>
+        </w:rPr>
+        <w:t>Look in</w:t>
+      </w:r>
+      <w:r>
+        <w:rPr>
+          <w:rFonts w:eastAsia="Times New Roman" w:cs="Times New Roman"/>
+          <w:kern w:val="0"/>
+          <w14:ligatures w14:val="none"/>
+        </w:rPr>
+        <w:t>: Tim Thomasson\Interactive-Pet-Marketplace\Documents</w:t>
+      </w:r>
+    </w:p>
+    <w:p>
+      <w:pPr>
+        <w:rPr>
+          <w:rFonts w:eastAsia="Times New Roman" w:cs="Times New Roman"/>
+          <w:kern w:val="0"/>
+          <w14:ligatures w14:val="none"/>
+        </w:rPr>
+      </w:pPr>
+      <w:r>
+        <w:rPr>
+          <w:rFonts w:eastAsia="Times New Roman" w:cs="Times New Roman"/>
+          <w:kern w:val="0"/>
+          <w14:ligatures w14:val="none"/>
+        </w:rPr>
+        <w:t>Update spreadsheet</w:t>
+      </w:r>
+    </w:p>
+    <w:p>
+      <w:pPr>
+        <w:rPr>
+          <w:rFonts w:eastAsia="Times New Roman" w:cs="Times New Roman"/>
+          <w:kern w:val="0"/>
+          <w14:ligatures w14:val="none"/>
+        </w:rPr>
+      </w:pPr>
+      <w:r>
+        <w:rPr>
+          <w:rFonts w:eastAsia="Times New Roman" w:cs="Times New Roman"/>
+          <w:kern w:val="0"/>
+          <w14:ligatures w14:val="none"/>
+        </w:rPr>
+        <w:t xml:space="preserve">Run: </w:t>
+      </w:r>
+    </w:p>
+    <w:p>
+      <w:pPr>
+        <w:pStyle w:val="ListParagraph"/>
+        <w:numPr>
+          <w:ilvl w:val="0"/>
+          <w:numId w:val="5"/>
+        </w:numPr>
+        <w:rPr>
+          <w:rFonts w:eastAsia="Times New Roman" w:cs="Times New Roman"/>
+          <w:kern w:val="0"/>
+          <w14:ligatures w14:val="none"/>
+        </w:rPr>
+      </w:pPr>
+      <w:r>
+        <w:rPr>
+          <w:rFonts w:eastAsia="Times New Roman" w:cs="Times New Roman"/>
+          <w:kern w:val="0"/>
+          <w14:ligatures w14:val="none"/>
+        </w:rPr>
+        <w:t>cd "C:\Users\Tim Thomasson\Interactive-Pet-Marketplace"</w:t>
+      </w:r>
+    </w:p>
+    <w:p>
+      <w:pPr>
+        <w:pStyle w:val="ListParagraph"/>
+        <w:numPr>
+          <w:ilvl w:val="0"/>
+          <w:numId w:val="5"/>
+        </w:numPr>
+        <w:rPr>
+          <w:rFonts w:eastAsia="Times New Roman" w:cs="Times New Roman"/>
+          <w:kern w:val="0"/>
+          <w14:ligatures w14:val="none"/>
+        </w:rPr>
+      </w:pPr>
+      <w:proofErr w:type="spellStart"/>
+      <w:r>
+        <w:rPr>
+          <w:rFonts w:eastAsia="Times New Roman" w:cs="Times New Roman"/>
+          <w:kern w:val="0"/>
+          <w14:ligatures w14:val="none"/>
+        </w:rPr>
+        <w:t>npm</w:t>
+      </w:r>
+      <w:proofErr w:type="spellEnd"/>
+      <w:r>
+        <w:rPr>
+          <w:rFonts w:eastAsia="Times New Roman" w:cs="Times New Roman"/>
+          <w:kern w:val="0"/>
+          <w14:ligatures w14:val="none"/>
+        </w:rPr>
+        <w:t xml:space="preserve"> run </w:t>
+      </w:r>
+      <w:proofErr w:type="spellStart"/>
       <w:proofErr w:type="gramStart"/>
       <w:r>
         <w:rPr>
@@ -1425,63 +1004,20 @@
           <w:kern w:val="0"/>
           <w14:ligatures w14:val="none"/>
         </w:rPr>
-        <w:t>changed</w:t>
-      </w:r>
+        <w:t>generate:products</w:t>
+      </w:r>
+      <w:proofErr w:type="spellEnd"/>
       <w:proofErr w:type="gramEnd"/>
-      <w:r>
-        <w:rPr>
-          <w:rFonts w:eastAsia="Times New Roman" w:cs="Times New Roman"/>
-          <w:kern w:val="0"/>
-          <w14:ligatures w14:val="none"/>
-        </w:rPr>
-        <w:t xml:space="preserve">. Short and descriptive is </w:t>
-      </w:r>
-      <w:proofErr w:type="gramStart"/>
-      <w:r>
-        <w:rPr>
-          <w:rFonts w:eastAsia="Times New Roman" w:cs="Times New Roman"/>
-          <w:kern w:val="0"/>
-          <w14:ligatures w14:val="none"/>
-        </w:rPr>
-        <w:t>best — "</w:t>
-      </w:r>
-      <w:proofErr w:type="gramEnd"/>
-      <w:r>
-        <w:rPr>
-          <w:rFonts w:eastAsia="Times New Roman" w:cs="Times New Roman"/>
-          <w:kern w:val="0"/>
-          <w14:ligatures w14:val="none"/>
-        </w:rPr>
-        <w:t>Update homepage header" is better than "changes" or "update."</w:t>
-      </w:r>
-    </w:p>
-    <w:p>
-      <w:pPr>
-        <w:rPr>
-          <w:rFonts w:eastAsia="Times New Roman" w:cs="Times New Roman"/>
-          <w:kern w:val="0"/>
-          <w14:ligatures w14:val="none"/>
-        </w:rPr>
-      </w:pPr>
-      <w:r>
-        <w:rPr>
-          <w:rFonts w:eastAsia="Times New Roman" w:cs="Times New Roman"/>
-          <w:kern w:val="0"/>
-          <w14:ligatures w14:val="none"/>
-        </w:rPr>
-        <w:t>Let me know what happens when you run them.</w:t>
-      </w:r>
-    </w:p>
-    <w:p>
-      <w:pPr>
-        <w:rPr>
-          <w:rFonts w:eastAsia="Times New Roman" w:cs="Times New Roman"/>
-          <w:kern w:val="0"/>
-          <w14:ligatures w14:val="none"/>
-        </w:rPr>
-      </w:pPr>
-    </w:p>
-    <w:p/>
+    </w:p>
+    <w:p>
+      <w:pPr>
+        <w:rPr>
+          <w:rFonts w:eastAsia="Times New Roman" w:cs="Times New Roman"/>
+          <w:kern w:val="0"/>
+          <w14:ligatures w14:val="none"/>
+        </w:rPr>
+      </w:pPr>
+    </w:p>
     <w:sectPr>
       <w:pgSz w:w="12240" w:h="15840"/>
       <w:pgMar w:top="1440" w:right="1440" w:bottom="1440" w:left="1440" w:header="720" w:footer="720" w:gutter="0"/>
@@ -1761,6 +1297,119 @@
     </w:lvl>
   </w:abstractNum>
   <w:abstractNum w:abstractNumId="2" w15:restartNumberingAfterBreak="0">
+    <w:nsid w:val="30B66882"/>
+    <w:multiLevelType w:val="hybridMultilevel"/>
+    <w:tmpl w:val="0CEAD1C0"/>
+    <w:lvl w:ilvl="0" w:tplc="04090001">
+      <w:start w:val="1"/>
+      <w:numFmt w:val="bullet"/>
+      <w:lvlText w:val=""/>
+      <w:lvlJc w:val="left"/>
+      <w:pPr>
+        <w:ind w:left="720" w:hanging="360"/>
+      </w:pPr>
+      <w:rPr>
+        <w:rFonts w:ascii="Symbol" w:hAnsi="Symbol" w:hint="default"/>
+      </w:rPr>
+    </w:lvl>
+    <w:lvl w:ilvl="1" w:tplc="04090003" w:tentative="1">
+      <w:start w:val="1"/>
+      <w:numFmt w:val="bullet"/>
+      <w:lvlText w:val="o"/>
+      <w:lvlJc w:val="left"/>
+      <w:pPr>
+        <w:ind w:left="1440" w:hanging="360"/>
+      </w:pPr>
+      <w:rPr>
+        <w:rFonts w:ascii="Courier New" w:hAnsi="Courier New" w:cs="Courier New" w:hint="default"/>
+      </w:rPr>
+    </w:lvl>
+    <w:lvl w:ilvl="2" w:tplc="04090005" w:tentative="1">
+      <w:start w:val="1"/>
+      <w:numFmt w:val="bullet"/>
+      <w:lvlText w:val=""/>
+      <w:lvlJc w:val="left"/>
+      <w:pPr>
+        <w:ind w:left="2160" w:hanging="360"/>
+      </w:pPr>
+      <w:rPr>
+        <w:rFonts w:ascii="Wingdings" w:hAnsi="Wingdings" w:hint="default"/>
+      </w:rPr>
+    </w:lvl>
+    <w:lvl w:ilvl="3" w:tplc="04090001" w:tentative="1">
+      <w:start w:val="1"/>
+      <w:numFmt w:val="bullet"/>
+      <w:lvlText w:val=""/>
+      <w:lvlJc w:val="left"/>
+      <w:pPr>
+        <w:ind w:left="2880" w:hanging="360"/>
+      </w:pPr>
+      <w:rPr>
+        <w:rFonts w:ascii="Symbol" w:hAnsi="Symbol" w:hint="default"/>
+      </w:rPr>
+    </w:lvl>
+    <w:lvl w:ilvl="4" w:tplc="04090003" w:tentative="1">
+      <w:start w:val="1"/>
+      <w:numFmt w:val="bullet"/>
+      <w:lvlText w:val="o"/>
+      <w:lvlJc w:val="left"/>
+      <w:pPr>
+        <w:ind w:left="3600" w:hanging="360"/>
+      </w:pPr>
+      <w:rPr>
+        <w:rFonts w:ascii="Courier New" w:hAnsi="Courier New" w:cs="Courier New" w:hint="default"/>
+      </w:rPr>
+    </w:lvl>
+    <w:lvl w:ilvl="5" w:tplc="04090005" w:tentative="1">
+      <w:start w:val="1"/>
+      <w:numFmt w:val="bullet"/>
+      <w:lvlText w:val=""/>
+      <w:lvlJc w:val="left"/>
+      <w:pPr>
+        <w:ind w:left="4320" w:hanging="360"/>
+      </w:pPr>
+      <w:rPr>
+        <w:rFonts w:ascii="Wingdings" w:hAnsi="Wingdings" w:hint="default"/>
+      </w:rPr>
+    </w:lvl>
+    <w:lvl w:ilvl="6" w:tplc="04090001" w:tentative="1">
+      <w:start w:val="1"/>
+      <w:numFmt w:val="bullet"/>
+      <w:lvlText w:val=""/>
+      <w:lvlJc w:val="left"/>
+      <w:pPr>
+        <w:ind w:left="5040" w:hanging="360"/>
+      </w:pPr>
+      <w:rPr>
+        <w:rFonts w:ascii="Symbol" w:hAnsi="Symbol" w:hint="default"/>
+      </w:rPr>
+    </w:lvl>
+    <w:lvl w:ilvl="7" w:tplc="04090003" w:tentative="1">
+      <w:start w:val="1"/>
+      <w:numFmt w:val="bullet"/>
+      <w:lvlText w:val="o"/>
+      <w:lvlJc w:val="left"/>
+      <w:pPr>
+        <w:ind w:left="5760" w:hanging="360"/>
+      </w:pPr>
+      <w:rPr>
+        <w:rFonts w:ascii="Courier New" w:hAnsi="Courier New" w:cs="Courier New" w:hint="default"/>
+      </w:rPr>
+    </w:lvl>
+    <w:lvl w:ilvl="8" w:tplc="04090005" w:tentative="1">
+      <w:start w:val="1"/>
+      <w:numFmt w:val="bullet"/>
+      <w:lvlText w:val=""/>
+      <w:lvlJc w:val="left"/>
+      <w:pPr>
+        <w:ind w:left="6480" w:hanging="360"/>
+      </w:pPr>
+      <w:rPr>
+        <w:rFonts w:ascii="Wingdings" w:hAnsi="Wingdings" w:hint="default"/>
+      </w:rPr>
+    </w:lvl>
+  </w:abstractNum>
+  <w:abstractNum w:abstractNumId="3" w15:restartNumberingAfterBreak="0">
     <w:nsid w:val="70665060"/>
     <w:multiLevelType w:val="multilevel"/>
     <w:tmpl w:val="96EE9ECC"/>
@@ -1873,7 +1522,7 @@
       </w:pPr>
     </w:lvl>
   </w:abstractNum>
-  <w:abstractNum w:abstractNumId="3" w15:restartNumberingAfterBreak="0">
+  <w:abstractNum w:abstractNumId="4" w15:restartNumberingAfterBreak="0">
     <w:nsid w:val="7DB31023"/>
     <w:multiLevelType w:val="multilevel"/>
     <w:tmpl w:val="924C0A52"/>
@@ -1997,9 +1646,12 @@
     <w:abstractNumId w:val="0"/>
   </w:num>
   <w:num w:numId="3" w16cid:durableId="868758907">
+    <w:abstractNumId w:val="4"/>
+  </w:num>
+  <w:num w:numId="4" w16cid:durableId="1248422632">
     <w:abstractNumId w:val="3"/>
   </w:num>
-  <w:num w:numId="4" w16cid:durableId="1248422632">
+  <w:num w:numId="5" w16cid:durableId="1402483422">
     <w:abstractNumId w:val="2"/>
   </w:num>
 </w:numbering>

</xml_diff>